<commit_message>
Add site search, animation and loading study variants
</commit_message>
<xml_diff>
--- a/docs/Profielwerkstuk UI design voor uncs - met voorbeelden.docx
+++ b/docs/Profielwerkstuk UI design voor uncs - met voorbeelden.docx
@@ -9651,9 +9651,8 @@
       <w:pPr>
         <w:spacing w:after="120"/>
       </w:pPr>
-      <w:r/>
-      <w:r>
-        <w:t>In dit onderzoek vertalen we de literatuur over toegankelijk interfaceontwerp naar een werkend lokaal webprototype van een fictieve zorgpraktijk. We onderzoeken tekstgrootte, navigatie, contrast en functionele animaties afzonderlijk en vergelijken daarnaast een basisontwerp met een ontwerp waarin de aanpassingen samenkomen. De vijf A/B-vergelijkingen gebruiken telkens de boekingstaak. Twee aanvullende siteopdrachten per deelnemer onderzoeken verkennend of informatie tussen de overige pagina’s vindbaar is; deze tellen niet mee in de A/B-uitkomsten.</w:t>
+      <w:r>
+        <w:t>In dit onderzoek vertalen we de literatuur over toegankelijk interfaceontwerp naar een werkend lokaal webprototype van een fictieve zorgpraktijk. We onderzoeken tekstgrootte, navigatie, contrast en functionele animaties afzonderlijk, vergelijken een basisontwerp met een gecombineerd ontwerp en testen het effect van twee laadschermen bij gelijke wachttijd. De zes A/B-vergelijkingen gebruiken telkens de boekingstaak. Twee aanvullende informatieopdrachten en een fictieve inlogopdracht per deelnemer onderzoeken de overige sitefuncties verkennend; deze tellen niet mee in de A/B-uitkomsten.</w:t>
       </w:r>
     </w:p>
     <w:p>
@@ -9688,10 +9687,7 @@
         <w:spacing w:after="120"/>
       </w:pPr>
       <w:r>
-        <w:rPr>
-          <w:rFonts w:ascii="Cambria" w:hAnsi="Cambria"/>
-        </w:rPr>
-        <w:t>De hoofdvraag werken we uit in vier deelvragen:</w:t>
+        <w:t>De hoofdvraag werken we uit in vijf deelvragen:</w:t>
       </w:r>
     </w:p>
     <w:p>
@@ -9723,7 +9719,13 @@
         <w:spacing w:after="120"/>
       </w:pPr>
       <w:r>
-        <w:t>4. In hoeverre helpt een korte, functionele bevestigingsanimatie ouderen om te herkennen dat hun afspraak is geboekt, vergeleken met dezelfde bevestiging zonder beweging?</w:t>
+        <w:t>4. In hoeverre helpen functionele animaties tijdens de boekingsroute en op het bevestigingsscherm ouderen om de voortgang en afronding te herkennen, vergeleken met dezelfde schermen zonder beweging?</w:t>
+      </w:r>
+    </w:p>
+    <w:p>
+      <w:pPr/>
+      <w:r>
+        <w:t>5. In hoeverre beïnvloedt een skeletonscherm tijdens een even lange vertraging het geduld, de onzekerheid en de frustratie bij het boeken, vergeleken met een leeg laadscherm?</w:t>
       </w:r>
     </w:p>
     <w:p>
@@ -9899,9 +9901,8 @@
       <w:pPr>
         <w:spacing w:after="120"/>
       </w:pPr>
-      <w:r/>
-      <w:r>
-        <w:t>Iedere deelnemer voert tien boekingen uit: vijf taakparen met telkens een basisvariant A en een aangepaste variant B. Daarnaast voeren deelnemers twee verkennende opdrachten uit waarbij zij informatie op de site zoeken zonder een afspraak te maken. Er zijn dus twaalf taken per volledige sessie. De siteopdrachten staan buiten de vijf gepaarde A/B-vergelijkingen en krijgen een eigen registratie en analyse.</w:t>
+      <w:r>
+        <w:t>Iedere deelnemer voert twaalf boekingen uit: zes taakparen met telkens variant A en B. Daarnaast voeren deelnemers twee verkennende informatieopdrachten en een fictieve inlogopdracht uit zonder een afspraak te maken. Er zijn dus vijftien taken per volledige sessie. De drie extra opdrachten staan buiten de zes gepaarde A/B-vergelijkingen en krijgen een eigen registratie en analyse.</w:t>
       </w:r>
     </w:p>
     <w:p>
@@ -9909,10 +9910,7 @@
         <w:spacing w:after="120"/>
       </w:pPr>
       <w:r>
-        <w:rPr>
-          <w:rFonts w:ascii="Cambria" w:hAnsi="Cambria"/>
-        </w:rPr>
-        <w:t>We streven naar 25 deelnemers: 13 op smartphone en 12 op desktop. Iedereen test alle vijf taakparen op één apparaat. We wijzen bij voorkeur een apparaat toe waarmee de deelnemer enige ervaring heeft. De verdeling is daardoor niet volledig willekeurig. We vergelijken varianten eerst binnen ieder apparaattype en trekken geen causale conclusie over welk apparaat beter is.</w:t>
+        <w:t>We streven naar 25 deelnemers: 13 op smartphone en 12 op desktop. Iedereen test alle zes taakparen op een apparaat. We wijzen bij voorkeur een apparaat toe waarmee de deelnemer enige ervaring heeft. De verdeling is daardoor niet volledig willekeurig. We vergelijken varianten eerst binnen ieder apparaattype en trekken geen causale conclusie over welk apparaat beter is.</w:t>
       </w:r>
     </w:p>
     <w:p>
@@ -10014,9 +10012,8 @@
       <w:pPr>
         <w:spacing w:after="120"/>
       </w:pPr>
-      <w:r/>
-      <w:r>
-        <w:t>We gebruiken een werkend lokaal webprototype met een fictieve praktijkwebsite. De onderzoeker kiest eerst op een apart startscherm het taakpaar, de A/B-variant en de opdrachtversie. Na de startknop ziet de deelnemer de publieke homepage. De boekingsroute loopt vervolgens via dienst kiezen, datum kiezen, tijd kiezen, controleren en bevestigen. De bevestiging toont de gekozen gegevens. Dezelfde route werkt op smartphone en desktop; alleen de schermindeling past zich aan. Ook de overige informatiepagina’s en zichtbare links zijn aanklikbaar.</w:t>
+      <w:r>
+        <w:t>We gebruiken een werkend lokaal webprototype met een fictieve praktijkwebsite. De onderzoeker kiest eerst met schakelknoppen op een apart startscherm het taakpaar, de A/B-variant en de opdrachtversie. Na de startknop ziet de deelnemer de publieke homepage. De boekingsroute loopt vervolgens via dienst kiezen, datum kiezen, tijd kiezen, controleren en een volledig scherm met de bevestiging. Dezelfde route werkt op smartphone en desktop; alleen de schermindeling past zich aan. Ook de overige informatiepagina's, de zoekbalk en het fictieve inloggen zijn aanklikbaar.</w:t>
       </w:r>
     </w:p>
     <w:p>
@@ -10118,7 +10115,7 @@
         <w:spacing w:after="120"/>
       </w:pPr>
       <w:r>
-        <w:t>We gebruiken een lichte achtergrond met kleurcode #FFF8F0. De relevante tekst heeft in variant A kleur #776F67 en in variant B #493B32. De berekende contrastverhoudingen zijn respectievelijk ongeveer 4,69:1 en 10,20:1. Beide voldoen voor gewone tekst aan de minimumverhouding van 4,5:1 uit WCAG 2.2 (W3C, 2023). We onderzoeken of extra contrast boven dat minimum tijdens deze boeking helpt. We veranderen de tekstkleur, maar niet tegelijk de grootte of plaats van de hoofdknop. Algemene kleurvoorkeur is geen afzonderlijke uitkomst.</w:t>
+        <w:t>We gebruiken een lichte achtergrond met kleurcode #FFF8F0. De relevante tekst in de boekingsinhoud heeft in variant A een bewust lichte kleur (#A69D93) en in variant B #493B32. De A-kleur heeft een lager contrast en voldoet niet aan de gebruikelijke WCAG-grens voor gewone tekst; daarom gebruiken we deze variant uitsluitend als afgebakende onderzoeksconditie in het fictieve prototype. We registreren leesproblemen en vermijden deze kleur buiten de contrastvergelijking. De tekstgrootte en plaats van de hoofdknop veranderen binnen dit paar niet.</w:t>
       </w:r>
     </w:p>
     <w:p>
@@ -10144,7 +10141,7 @@
         <w:spacing w:after="120"/>
       </w:pPr>
       <w:r>
-        <w:t>De taak is een afspraak plannen en herkennen wanneer de boeking is voltooid. In variant A verschijnt de blijvende bevestiging ‘Afspraak geboekt’ onmiddellijk zonder beweging. In variant B verschijnt dezelfde bevestiging met een korte verschuiving en vervaging van 250 milliseconden met een ease-out-curve. In geen van beide varianten is er extra wachttijd voordat de feedback begint. De overige boekingsschermen zijn gelijk.</w:t>
+        <w:t>De taak is een afspraak plannen en herkennen wanneer de boeking is voltooid. In variant A verschijnt ieder scherm zonder extra beweging. In variant B animeert GSAP de binnenkomende boekingsschermen en keuzeonderdelen kort met vervaging en verticale beweging; op het volledige bevestigingsscherm verschijnen ook de boodschap en bediening in volgorde. De inhoud en eindposities blijven gelijk. Er is geen extra wachttijd in deze vergelijking. Bij een ingestelde voorkeur voor minder beweging zijn de animaties uitgeschakeld.</w:t>
       </w:r>
     </w:p>
     <w:p>
@@ -10152,7 +10149,7 @@
         <w:spacing w:after="120"/>
       </w:pPr>
       <w:r>
-        <w:t>De tekst, eindpositie en verdere bediening zijn gelijk. We vergelijken zo de manier waarop dezelfde boekingsbevestiging verschijnt. Naast de gemeenschappelijke metingen registreren we herhaald drukken op ‘Afspraak bevestigen’ en twijfel over de afloop. We vragen na afloop neutraal wat duidelijk of onduidelijk was. De gekozen duur en curve zijn te toetsen ontwerpkeuzes, geen bewezen optimale instelling voor ouderen.</w:t>
+        <w:t>De tekst, eindpositie en verdere bediening zijn gelijk. We vergelijken hoe de route en dezelfde boekingsbevestiging worden waargenomen. Naast de gemeenschappelijke metingen registreren we herhaald drukken op Afspraak bevestigen en twijfel over de afloop. We vragen na afloop neutraal wat duidelijk of onduidelijk was. Duur, volgorde en bewegingscurve zijn te toetsen ontwerpkeuzes, geen bewezen optimale instellingen voor ouderen.</w:t>
       </w:r>
     </w:p>
     <w:p>
@@ -10170,7 +10167,7 @@
         <w:spacing w:after="120"/>
       </w:pPr>
       <w:r>
-        <w:t>Het vijfde taakpaar gebruikt opnieuw de volledige boekingsroute. Variant A combineert de basiseigenschappen uit de afzonderlijke vergelijkingen. Variant B combineert grotere tekst, zichtbare navigatie, hoger tekstcontrast en de korte bevestigingsanimatie. In B krijgt de belangrijkste vervolgstap bovendien meer visuele nadruk door een herkenbare hoofdknop en groepering van bijbehorende informatie.</w:t>
+        <w:t>Het vijfde taakpaar gebruikt opnieuw de volledige boekingsroute. Variant A combineert de basiseigenschappen uit de afzonderlijke vergelijkingen. Variant B combineert grotere tekst, zichtbare navigatie, hoger tekstcontrast en de functionele GSAP-animaties. In B krijgt de belangrijkste vervolgstap bovendien meer visuele nadruk door een herkenbare hoofdknop en groepering van bijbehorende informatie.</w:t>
       </w:r>
     </w:p>
     <w:p>
@@ -10186,11 +10183,23 @@
       <w:pPr>
         <w:pStyle w:val="Kop3"/>
       </w:pPr>
-      <w:bookmarkStart w:id="66" w:name="_Toc240533832"/>
-      <w:r>
-        <w:t>4.3.6 Hulpmiddelen en grenzen van het prototype</w:t>
-      </w:r>
-      <w:bookmarkEnd w:id="66"/>
+      <w:r>
+        <w:t>4.3.6 Geduld bij laden</w:t>
+      </w:r>
+    </w:p>
+    <w:p>
+      <w:pPr/>
+      <w:r>
+        <w:t>Het zesde taakpaar gebruikt dezelfde boekingsroute, tekst, opties en objectieve wachttijd in A en B. Bij iedere schermovergang duurt de kunstmatige vertraging 1,4 seconde. In A ziet de deelnemer tijdens die periode alleen een leeg, crèmekleurig scherm; in B een skeletonscherm dat de globale opbouw van de volgende pagina aanduidt. Het aantal en de duur van de vertragingen zijn gelijk. We registreren of de deelnemer doorgaat, de ervaren wachttijd, frustratie, onzekerheid en opmerkingen over de voortgang. Het verschil kan daardoor worden toegeschreven aan de zichtbare terugkoppeling, binnen de grenzen van deze proefopzet.</w:t>
+      </w:r>
+    </w:p>
+    <w:p>
+      <w:pPr>
+        <w:pStyle w:val="Kop3"/>
+      </w:pPr>
+      <w:r>
+        <w:t>4.3.7 Hulpmiddelen en grenzen van het prototype</w:t>
+      </w:r>
     </w:p>
     <w:p>
       <w:pPr>
@@ -10217,13 +10226,13 @@
     <w:p>
       <w:pPr/>
       <w:r>
-        <w:t>De publieke homepage toont een directe afspraakknop, vijf zorggebieden, praktische informatie en beeldkaarten. Via het hoofdmenu, het kruimelpad, verwante links en de footer zijn onder meer locaties, tarieven, veelgestelde vragen, energiemanagement en groepsbewegen bereikbaar. Foto’s van therapie, bewegen, de praktijk en groepsactiviteiten geven de site meer visuele variatie; andere inhoudspagina’s kunnen als geloofwaardige omweg afleiden van een boeking. De boekingsschermen houden de navigatie van de vijf A/B-tests afgebakend.</w:t>
+        <w:t>De publieke homepage toont een directe afspraakknop, vijf zorggebieden, praktische informatie en beeldkaarten. Via het hoofdmenu, de zoekbalk, het kruimelpad, verwante links en de footer zijn onder meer locaties, tarieven, veelgestelde vragen, energiemanagement en groepsbewegen bereikbaar. Het desktopmenu opent bij aanwijzen of toetsenbordfocus; het mobiele menu vult de beschikbare schermhoogte. Foto's van therapie, bewegen, de praktijk en groepsactiviteiten geven de site meer visuele variatie. Andere inhoudspagina's kunnen als geloofwaardige omweg afleiden van een boeking.</w:t>
       </w:r>
     </w:p>
     <w:p>
       <w:pPr/>
       <w:r>
-        <w:t>De vier verkennende sitevragen gaan over energiemanagement (energie vragende en rustmomenten), de voorbeeldlocatie (Valkenswaard centrum), het fictieve karakter van een afspraak en de doelgroep van groepsbewegen. Per deelnemer staan twee van deze vier vragen in het vooraf vastgelegde rooster, na het tweede en vierde boekingspaar. We leggen de juiste pagina en het verwachte antwoord vooraf vast. In de analyse rapporteren we deze zoekopdrachten los van de boekingsvergelijkingen, omdat taaktype en doel anders zijn.</w:t>
+        <w:t>De vier verkennende informatievragen gaan over energiemanagement, de voorbeeldlocatie, het fictieve karakter van een afspraak en de doelgroep van groepsbewegen. Per deelnemer staan twee van deze vier vragen in het vooraf vastgelegde rooster, na het tweede en vierde boekingspaar. Een vijfde extra opdracht na het zesde paar vraagt de deelnemer in te loggen met het vooraf op de opdrachtkaart gegeven fictieve adres alex.voorbeeld@example.invalid. Het prototype verzendt geen e-mail en maakt geen echt account aan. We leggen de juiste pagina en het verwachte antwoord vooraf vast en analyseren deze drie extra taken afzonderlijk van de boekingsvergelijkingen.</w:t>
       </w:r>
     </w:p>
     <w:p>
@@ -10261,25 +10270,62 @@
         <w:spacing w:after="120"/>
       </w:pPr>
       <w:r>
-        <w:t>Ook de volgorde van de vijf vergelijkingen wisselen we af. We gebruiken vijf cyclische volgordes: 1-2-3-4-5, 2-3-4-5-1, 3-4-5-1-2, 4-5-1-2-3 en 5-1-2-3-4. Binnen beide apparaatgroepen delen we deze zo gelijk mogelijk uit. Vooraf leggen we per deelnemercode de volledige volgorde vast. Het tienmaal doorlopen van dezelfde route kan alsnog leer- en vermoeidheidseffecten geven; die bespreken we bij de interpretatie.</w:t>
+        <w:t>Ook de volgorde van de zes vergelijkingen wisselen we af. We gebruiken zes cyclische volgordes, telkens een verschuiving van 1-2-3-4-5-6. Binnen beide apparaatgroepen delen we deze zo gelijk mogelijk uit. Vooraf leggen we per deelnemercode de volledige volgorde vast. Het twaalfmaal doorlopen van dezelfde route kan alsnog leer- en vermoeidheidseffecten geven; die bespreken we bij de interpretatie.</w:t>
       </w:r>
     </w:p>
     <w:p>
       <w:pPr>
         <w:spacing w:after="120"/>
       </w:pPr>
+      <w:r>
+        <w:t>De totale sessieduur, inclusief vijftien taken, schaalvragen en pauzes, bepalen we in de proeftest. We leggen uit dat we het ontwerp onderzoeken en dat vastlopen geen oordeel over de deelnemer is. Daarna verzamelen we achtergrondgegevens en laten we kort zien hoe tikken of klikken werkt, zonder een boeking, zoekopdracht of inlogopdracht voor te doen.</w:t>
+      </w:r>
+    </w:p>
+    <w:p>
+      <w:pPr>
+        <w:spacing w:after="120"/>
+      </w:pPr>
       <w:r/>
       <w:r>
-        <w:t>De totale sessieduur, inclusief twaalf taken, schaalvragen en pauzes, bepalen we in de proeftest. We leggen uit dat we het ontwerp onderzoeken en dat vastlopen geen oordeel over de deelnemer is. Daarna verzamelen we achtergrondgegevens en laten we kort zien hoe tikken of klikken werkt, zonder een boeking of zoekopdracht voor te doen.</w:t>
+        <w:t>We lezen bij iedere boeking de gevraagde dienst, datum en tijd op dezelfde manier voor; de opdracht blijft daarnaast leesbaar beschikbaar buiten de deelnemerssite. Bij twee extra taken lezen we een korte zoekvraag voor en vragen we de deelnemer een antwoord op de site te vinden, zonder een afspraak te boeken. De deelnemer vertelt wat hij of zij zoekt of onduidelijk vindt. We geven tijdens de meting geen hints. Na iedere taak volgen twee korte schaalvragen. Na het tweede en vierde boekingspaar bieden we een pauze aan, en eerder als iemand dat nodig heeft.</w:t>
       </w:r>
     </w:p>
     <w:p>
       <w:pPr>
         <w:spacing w:after="120"/>
       </w:pPr>
+      <w:r>
+        <w:rPr>
+          <w:rFonts w:ascii="Cambria" w:hAnsi="Cambria"/>
+        </w:rPr>
+        <w:t>Meestal zijn wij beiden aanwezig: één begeleidt de sessie en één registreert en timet. Als slechts één onderzoeker aanwezig is, controleert de ander de registratie achteraf met de opname. We testen waar mogelijk in een rustige ruimte zonder meedenkende familieleden. Afwijkingen, onderbrekingen en wisselingen van begeleider noteren we.</w:t>
+      </w:r>
+    </w:p>
+    <w:p>
+      <w:pPr>
+        <w:pStyle w:val="Kop2"/>
+      </w:pPr>
+      <w:bookmarkStart w:id="68" w:name="_Toc240533834"/>
+      <w:r>
+        <w:t>4.5 Dataverzameling en datakenmerken</w:t>
+      </w:r>
+      <w:bookmarkEnd w:id="68"/>
+    </w:p>
+    <w:p>
+      <w:pPr>
+        <w:spacing w:after="120"/>
+      </w:pPr>
+      <w:r>
+        <w:t>Per taakuitvoering leggen we de deelnemercode, het apparaat, taaknummer, taaksoort, volgorde en vergrotingsinstelling vast. Voor boekingen registreren we ook taakpaar, ontwerpvariant en inhoudsversie; voor extra taken de zoek- of inlogvraag, bezochte pagina's en het gegeven antwoord. Een rij staat voor een uitgevoerde taak. Bij 25 volledige sessies zijn dat maximaal 375 taakregistraties: 300 boekingen, 50 informatieopdrachten en 25 inlogopdrachten. Dit zijn herhaalde metingen bij 25 personen, geen onafhankelijke deelnemers.</w:t>
+      </w:r>
+    </w:p>
+    <w:p>
+      <w:pPr>
+        <w:spacing w:after="120"/>
+      </w:pPr>
       <w:r/>
       <w:r>
-        <w:t>We lezen bij iedere boeking de gevraagde dienst, datum en tijd op dezelfde manier voor; de opdracht blijft daarnaast leesbaar beschikbaar buiten de deelnemerssite. Bij twee extra taken lezen we een korte zoekvraag voor en vragen we de deelnemer een antwoord op de site te vinden, zonder een afspraak te boeken. De deelnemer vertelt wat hij of zij zoekt of onduidelijk vindt. We geven tijdens de meting geen hints. Na iedere taak volgen twee korte schaalvragen. Na het tweede en vierde boekingspaar bieden we een pauze aan, en eerder als iemand dat nodig heeft.</w:t>
+        <w:t>Zelfstandig slagen registreren we als ja of nee. Een boeking slaagt als de deelnemer binnen maximaal drie minuten zonder inhoudelijke hulp de gevraagde dienst, datum en tijd kiest en de bevestiging “Afspraak geboekt” bereikt. Zelfstandig herstelde fouten sluiten slagen niet uit. Voor iedere inhoudsversie leggen we de juiste combinatie vooraf vast. Bij een siteopdracht noteren we afzonderlijk of de deelnemer binnen drie minuten de bedoelde informatiepagina bereikt en het vooraf vastgelegde antwoord geeft. Deze uitkomst telt niet mee als boekingssucces.</w:t>
       </w:r>
     </w:p>
     <w:p>
@@ -10290,111 +10336,63 @@
         <w:rPr>
           <w:rFonts w:ascii="Cambria" w:hAnsi="Cambria"/>
         </w:rPr>
-        <w:t>Meestal zijn wij beiden aanwezig: één begeleidt de sessie en één registreert en timet. Als slechts één onderzoeker aanwezig is, controleert de ander de registratie achteraf met de opname. We testen waar mogelijk in een rustige ruimte zonder meedenkende familieleden. Afwijkingen, onderbrekingen en wisselingen van begeleider noteren we.</w:t>
+        <w:t>De tijd start zodra de opdracht is voorgelezen en het startscherm beschikbaar is. De tijd stopt bij het einddoel, opgeven, de tijdgrens of beëindiging wegens hulp. We registreren seconden en de reden van stoppen. Een deelnemer mag de opdracht opnieuw laten voorlezen; dat telt niet als inhoudelijke hulp en de tijd loopt door. Bij een hulpvraag geven we geen aanwijzing. Als de deelnemer zonder hulp niet verder wil of kan, eindigt de taak als niet zelfstandig geslaagd.</w:t>
+      </w:r>
+    </w:p>
+    <w:p>
+      <w:pPr>
+        <w:spacing w:after="120"/>
+      </w:pPr>
+      <w:r>
+        <w:t>Als fout tellen we een onjuiste dienst, datum of tijd, een verkeerde boekingsstap of een onterechte of herhaalde bevestiging. We leggen vooraf concrete foutcodes vast. Het openen van het bedoelde menu, nodig scrollen of een toegestane alternatieve route telt niet als fout. Herhaalde verkeerde acties tellen afzonderlijk. Zelfcorrectie en hulpvragen registreren we apart.</w:t>
+      </w:r>
+    </w:p>
+    <w:p>
+      <w:pPr>
+        <w:spacing w:after="120"/>
+      </w:pPr>
+      <w:r>
+        <w:rPr>
+          <w:rFonts w:ascii="Cambria" w:hAnsi="Cambria"/>
+        </w:rPr>
+        <w:t>Na iedere variant vragen we: ‘Hoeveel frustratie of ergernis voelde u tijdens deze opdracht?’ en ‘Hoe onzeker voelde u zich over wat u moest doen of over of het gelukt was?’ Beide vragen gebruiken dezelfde schaal: 1 = helemaal niet, 2 = weinig, 3 = matig, 4 = veel en 5 = heel veel. We vragen dit ook na een niet-geslaagde taak. Dit zijn twee afzonderlijke ordinale beoordelingen; we voegen ze niet samen tot één toegankelijkheidsscore.</w:t>
+      </w:r>
+    </w:p>
+    <w:p>
+      <w:pPr>
+        <w:spacing w:after="120"/>
+      </w:pPr>
+      <w:r>
+        <w:rPr>
+          <w:rFonts w:ascii="Cambria" w:hAnsi="Cambria"/>
+        </w:rPr>
+        <w:t>We maken met toestemming een schermopname en een opname van gezicht en stem. Een gezamenlijk startsignaal helpt om de opnames naast elkaar te leggen. We timen ook handmatig en controleren onduidelijke tijden op de schermopname. Uitspraken en zichtbaar gedrag gebruiken we als aanvullende observaties. Een gezichtsuitdrukking op zichzelf bewijst geen frustratie of onzekerheid; daarvoor blijven de antwoorden van de deelnemer leidend. De gezichtsopname is ook geen meting van oogbewegingen.</w:t>
+      </w:r>
+    </w:p>
+    <w:p>
+      <w:pPr>
+        <w:spacing w:after="120"/>
+      </w:pPr>
+      <w:r>
+        <w:t>Aan het einde vragen we welke versies van de boekingsroute makkelijker of moeilijker waren, wat daarbij hielp en welke aanpassing de deelnemer zelf zou willen behouden. De kwantitatieve gegevens bestaan uit categorieën, aantallen, tijden en ordinale scores. De kwalitatieve gegevens bestaan uit uitspraken, beschrijvingen van gedrag en antwoorden uit dit nagesprek.</w:t>
       </w:r>
     </w:p>
     <w:p>
       <w:pPr>
         <w:pStyle w:val="Kop2"/>
       </w:pPr>
-      <w:bookmarkStart w:id="68" w:name="_Toc240533834"/>
-      <w:r>
-        <w:t>4.5 Dataverzameling en datakenmerken</w:t>
-      </w:r>
-      <w:bookmarkEnd w:id="68"/>
+      <w:bookmarkStart w:id="69" w:name="_Toc240533835"/>
+      <w:r>
+        <w:t>4.6 Data-analyse</w:t>
+      </w:r>
+      <w:bookmarkEnd w:id="69"/>
     </w:p>
     <w:p>
       <w:pPr>
         <w:spacing w:after="120"/>
       </w:pPr>
       <w:r>
-        <w:rPr>
-          <w:rFonts w:ascii="Cambria" w:hAnsi="Cambria"/>
-        </w:rPr>
-      </w:r>
-      <w:r>
-        <w:t>Per taakuitvoering leggen we de deelnemercode, het apparaat, taaknummer, taaksoort, volgorde en vergrotingsinstelling vast. Voor boekingen registreren we ook taakpaar, ontwerpvariant en inhoudsversie; voor siteopdrachten de zoekvraag, bezochte pagina’s en het gegeven antwoord. Eén rij staat voor één uitgevoerde taak. Bij 25 volledige sessies zijn dat maximaal 300 taakregistraties: 250 boekingen en 50 verkennende siteopdrachten. Dit zijn herhaalde metingen bij 25 personen, geen onafhankelijke deelnemers.</w:t>
-      </w:r>
-    </w:p>
-    <w:p>
-      <w:pPr>
-        <w:spacing w:after="120"/>
-      </w:pPr>
-      <w:r/>
-      <w:r>
-        <w:t>Zelfstandig slagen registreren we als ja of nee. Een boeking slaagt als de deelnemer binnen maximaal drie minuten zonder inhoudelijke hulp de gevraagde dienst, datum en tijd kiest en de bevestiging “Afspraak geboekt” bereikt. Zelfstandig herstelde fouten sluiten slagen niet uit. Voor iedere inhoudsversie leggen we de juiste combinatie vooraf vast. Bij een siteopdracht noteren we afzonderlijk of de deelnemer binnen drie minuten de bedoelde informatiepagina bereikt en het vooraf vastgelegde antwoord geeft. Deze uitkomst telt niet mee als boekingssucces.</w:t>
-      </w:r>
-    </w:p>
-    <w:p>
-      <w:pPr>
-        <w:spacing w:after="120"/>
-      </w:pPr>
-      <w:r>
-        <w:rPr>
-          <w:rFonts w:ascii="Cambria" w:hAnsi="Cambria"/>
-        </w:rPr>
-        <w:t>De tijd start zodra de opdracht is voorgelezen en het startscherm beschikbaar is. De tijd stopt bij het einddoel, opgeven, de tijdgrens of beëindiging wegens hulp. We registreren seconden en de reden van stoppen. Een deelnemer mag de opdracht opnieuw laten voorlezen; dat telt niet als inhoudelijke hulp en de tijd loopt door. Bij een hulpvraag geven we geen aanwijzing. Als de deelnemer zonder hulp niet verder wil of kan, eindigt de taak als niet zelfstandig geslaagd.</w:t>
-      </w:r>
-    </w:p>
-    <w:p>
-      <w:pPr>
-        <w:spacing w:after="120"/>
-      </w:pPr>
-      <w:r>
-        <w:t>Als fout tellen we een onjuiste dienst, datum of tijd, een verkeerde boekingsstap of een onterechte of herhaalde bevestiging. We leggen vooraf concrete foutcodes vast. Het openen van het bedoelde menu, nodig scrollen of een toegestane alternatieve route telt niet als fout. Herhaalde verkeerde acties tellen afzonderlijk. Zelfcorrectie en hulpvragen registreren we apart.</w:t>
-      </w:r>
-    </w:p>
-    <w:p>
-      <w:pPr>
-        <w:spacing w:after="120"/>
-      </w:pPr>
-      <w:r>
-        <w:rPr>
-          <w:rFonts w:ascii="Cambria" w:hAnsi="Cambria"/>
-        </w:rPr>
-        <w:t>Na iedere variant vragen we: ‘Hoeveel frustratie of ergernis voelde u tijdens deze opdracht?’ en ‘Hoe onzeker voelde u zich over wat u moest doen of over of het gelukt was?’ Beide vragen gebruiken dezelfde schaal: 1 = helemaal niet, 2 = weinig, 3 = matig, 4 = veel en 5 = heel veel. We vragen dit ook na een niet-geslaagde taak. Dit zijn twee afzonderlijke ordinale beoordelingen; we voegen ze niet samen tot één toegankelijkheidsscore.</w:t>
-      </w:r>
-    </w:p>
-    <w:p>
-      <w:pPr>
-        <w:spacing w:after="120"/>
-      </w:pPr>
-      <w:r>
-        <w:rPr>
-          <w:rFonts w:ascii="Cambria" w:hAnsi="Cambria"/>
-        </w:rPr>
-        <w:t>We maken met toestemming een schermopname en een opname van gezicht en stem. Een gezamenlijk startsignaal helpt om de opnames naast elkaar te leggen. We timen ook handmatig en controleren onduidelijke tijden op de schermopname. Uitspraken en zichtbaar gedrag gebruiken we als aanvullende observaties. Een gezichtsuitdrukking op zichzelf bewijst geen frustratie of onzekerheid; daarvoor blijven de antwoorden van de deelnemer leidend. De gezichtsopname is ook geen meting van oogbewegingen.</w:t>
-      </w:r>
-    </w:p>
-    <w:p>
-      <w:pPr>
-        <w:spacing w:after="120"/>
-      </w:pPr>
-      <w:r>
-        <w:t>Aan het einde vragen we welke versies van de boekingsroute makkelijker of moeilijker waren, wat daarbij hielp en welke aanpassing de deelnemer zelf zou willen behouden. De kwantitatieve gegevens bestaan uit categorieën, aantallen, tijden en ordinale scores. De kwalitatieve gegevens bestaan uit uitspraken, beschrijvingen van gedrag en antwoorden uit dit nagesprek.</w:t>
-      </w:r>
-    </w:p>
-    <w:p>
-      <w:pPr>
-        <w:pStyle w:val="Kop2"/>
-      </w:pPr>
-      <w:bookmarkStart w:id="69" w:name="_Toc240533835"/>
-      <w:r>
-        <w:t>4.6 Data-analyse</w:t>
-      </w:r>
-      <w:bookmarkEnd w:id="69"/>
-    </w:p>
-    <w:p>
-      <w:pPr>
-        <w:spacing w:after="120"/>
-      </w:pPr>
-      <w:r>
-        <w:rPr>
-          <w:rFonts w:ascii="Cambria" w:hAnsi="Cambria"/>
-        </w:rPr>
-      </w:r>
-      <w:r>
-        <w:t>We analyseren in Excel de vijf boekingsvergelijkingen eerst apart voor smartphone en desktop. Per taakpaar vergelijken we A en B binnen dezelfde deelnemer. Voor zelfstandig slagen tonen we aantallen en percentages met het aantal geldige metingen. We vermelden hoeveel deelnemers beide varianten halen, alleen A, alleen B of geen van beide. Het verschil in succespercentage drukken we uit in procentpunten. De siteopdrachten beschrijven we apart met aantallen juiste antwoorden, gevonden pagina’s, tijd, omwegen en ervaringen; ze krijgen geen gepaarde A/B-effectschatting.</w:t>
+        <w:t>We analyseren in Excel de zes boekingsvergelijkingen eerst apart voor smartphone en desktop. Per taakpaar vergelijken we A en B binnen dezelfde deelnemer. Voor zelfstandig slagen tonen we aantallen en percentages met het aantal geldige metingen. We vermelden hoeveel deelnemers beide varianten halen, alleen A, alleen B of geen van beide. Het verschil in succespercentage drukken we uit in procentpunten. Voor test 6 vergelijken we daarnaast de waargenomen wachttijd, onzekerheid, frustratie en het al dan niet doorgaan, terwijl de feitelijke vertraging gelijk blijft. De informatie- en inlogopdrachten beschrijven we apart; ze krijgen geen gepaarde A/B-effectschatting.</w:t>
       </w:r>
     </w:p>
     <w:p>

</xml_diff>

<commit_message>
Rooster tot D100, micro-interacties en startmenu tussen taken
Lokale wijzigingen van 1 oktober die nog niet op GitHub stonden:
- deelnemerscodes D01-D100 (51 smartphone, 49 desktop)
- A laat per afzonderlijke test alleen het onderzochte kenmerk weg
- Animatie-schakelaar bestuurt alle micro-interacties
- laadscherm zonder skeleton toont geen waas meer
- startmenu 'Verder naar TXX' tussen taken
- Illustrator-script voor A4-opdrachtkaarten

Co-Authored-By: Claude Opus 5.5 (1M context) <noreply@anthropic.com>
Claude-Session: https://claude.ai/code/session_01PuksVGjBP1ZhdFD3NHTRpX
</commit_message>
<xml_diff>
--- a/docs/Profielwerkstuk UI design voor uncs - met voorbeelden.docx
+++ b/docs/Profielwerkstuk UI design voor uncs - met voorbeelden.docx
@@ -9719,7 +9719,7 @@
         <w:spacing w:after="120"/>
       </w:pPr>
       <w:r>
-        <w:t>4. In hoeverre helpen functionele animaties tijdens de boekingsroute en op het bevestigingsscherm ouderen om de voortgang en afronding te herkennen, vergeleken met dezelfde schermen zonder beweging?</w:t>
+        <w:t>4. In hoeverre helpen micro-interacties, waaronder knopfeedback en functionele animaties tijdens de boekingsroute en op het bevestigingsscherm, ouderen om de voortgang en afronding te herkennen, vergeleken met dezelfde schermen zonder deze micro-interacties?</w:t>
       </w:r>
     </w:p>
     <w:p>
@@ -9835,7 +9835,7 @@
         <w:rPr>
           <w:rFonts w:ascii="Cambria" w:hAnsi="Cambria"/>
         </w:rPr>
-        <w:t>Voor navigatie verwachten we dat een direct zichtbaar menu minder zoekwerk en twijfel veroorzaakt dan een verborgen menu. Bij animaties verwachten we hoogstens een voordeel wanneer de beweging een verandering verduidelijkt. Dezelfde beweging kan ook afleiden. Daarom vergelijken we een korte overgang met een onmiddellijke verandering, waarbij beide varianten dezelfde blijvende bevestiging geven. Lagere onzekerheid zonder verlies van zelfstandig slagen zou de meerwaarde van die animatie ondersteunen.</w:t>
+        <w:t>Voor navigatie verwachten we dat direct zichtbare opties minder zoekwerk en twijfel veroorzaken dan opties achter een menu. Bij micro-interacties verwachten we een voordeel wanneer knopfeedback en beweging een handeling of verandering verduidelijken. Beweging kan ook afleiden. Daarom vergelijken we dezelfde route met en zonder micro-interacties, terwijl de blijvende bevestiging en gekozen afspraakgegevens gelijk zijn. Lagere onzekerheid zonder verlies van zelfstandig slagen zou de meerwaarde van deze combinatie van micro-interacties ondersteunen.</w:t>
       </w:r>
     </w:p>
     <w:p>
@@ -10024,7 +10024,7 @@
         <w:rPr>
           <w:rFonts w:ascii="Cambria" w:hAnsi="Cambria"/>
         </w:rPr>
-        <w:t>In de afzonderlijke vergelijkingen veranderen we alleen het onderzochte kenmerk en de onvermijdelijke gevolgen ervan. Tekstinhoud, lettertype, labels, functies en niet-onderzochte vormgeving blijven gelijk. Als grotere tekst bijvoorbeeld meer regels inneemt, leggen we dat vast. Zo'n gevolg hoort bij deze concrete tekstvergroting, maar kan mede verklaren waarom een taak anders verloopt.</w:t>
+        <w:t>In de afzonderlijke vergelijkingen nemen we het volledig aangepaste ontwerp als uitgangspunt. In variant A staat alleen het onderzochte kenmerk uit; in variant B staan alle aanpassingen aan. Bij de teksttest gebruikt A dus kleinere tekst, terwijl zichtbare navigatie, hoog contrast, micro-interacties, skeletonschermen en de nadruk op hoofdacties aan blijven. Dezelfde regel geldt voor de navigatie-, contrast-, animatie- en laadschermtest. Tekstinhoud, lettertype, labels, functies en niet-onderzochte vormgeving blijven binnen ieder paar gelijk. We meten zo de bijdrage van één kenmerk binnen het aangepaste ontwerp. Onvermijdelijke gevolgen, zoals extra tekstregels of scrollen bij grotere tekst, registreren we apart.</w:t>
       </w:r>
     </w:p>
     <w:p>
@@ -10053,10 +10053,10 @@
       <w:pPr>
         <w:spacing w:after="120"/>
       </w:pPr>
+      <w:r>
+        <w:t>De taak is een afspraak plannen via de volledige boekingsroute. Variant A gebruikt relevante tekst van 16 ontwerppixels en kleinere koppen; variant B gebruikt relevante tekst van 24 ontwerppixels en grotere koppen. Het prototype gebruikt lokaal meegeleverde Noto Sans en voor de relevante tekst dezelfde relatieve regelhoogte van 1,5. Bij een basisgrootte van 16 pixels komt dit overeen met 1 en 1,5 rem. Zichtbare navigatie, hoog contrast, micro-interacties, skeletonschermen en de nadruk op hoofdacties blijven in beide varianten aan. We controleren de werkelijk gerenderde tekstmaten en terugloop op smartphone en desktop.</w:t>
+      </w:r>
       <w:r/>
-      <w:r>
-        <w:t>De taak is een afspraak plannen via de volledige boekingsroute. In dit taakpaar verschilt alleen de relevante tekstgrootte: variant A gebruikt 16 ontwerppixels en variant B 24. Het prototype gebruikt lokaal meegeleverde Noto Sans met dezelfde relatieve regelhoogte van 1,5. Bij een basisgrootte van 16 pixels komt dit overeen met 1 en 1,5 rem. We controleren de werkelijk gerenderde tekstmaten en terugloop op smartphone en desktop.</w:t>
-      </w:r>
     </w:p>
     <w:p>
       <w:pPr>
@@ -10115,7 +10115,7 @@
         <w:spacing w:after="120"/>
       </w:pPr>
       <w:r>
-        <w:t>We gebruiken een lichte achtergrond met kleurcode #FFF8F0. De relevante tekst in de boekingsinhoud heeft in variant A een bewust lichte kleur (#A69D93) en in variant B #493B32. De A-kleur heeft een lager contrast en voldoet niet aan de gebruikelijke WCAG-grens voor gewone tekst; daarom gebruiken we deze variant uitsluitend als afgebakende onderzoeksconditie in het fictieve prototype. We registreren leesproblemen en vermijden deze kleur buiten de contrastvergelijking. De tekstgrootte en plaats van de hoofdknop veranderen binnen dit paar niet.</w:t>
+        <w:t>We gebruiken een lichte achtergrond met kleurcode #FFF8F0. Met Contrast uit heeft de deelnemerssite tekstkleur #817971 en lichte kleuren voor randen en actieknoppen; buiten afbeeldingen blijft het contrast onder 4,5:1. Met Contrast aan gebruikt de site onder meer donkere tekstkleur #493B32. Variant A gebruikt de lage contrastinstelling en variant B het hoge contrast. Grotere tekst, zichtbare navigatie, micro-interacties, skeletonschermen en de nadruk op hoofdacties blijven in beide varianten aan. De lage contrastinstelling dient uitsluitend als onderzoeksconditie in het fictieve prototype. We registreren leesproblemen en controleren de kleuren op de gebruikte apparaten.</w:t>
       </w:r>
     </w:p>
     <w:p>
@@ -10141,7 +10141,7 @@
         <w:spacing w:after="120"/>
       </w:pPr>
       <w:r>
-        <w:t>De taak is een afspraak plannen en herkennen wanneer de boeking is voltooid. In variant A verschijnt ieder scherm zonder extra beweging. In variant B animeert GSAP de binnenkomende boekingsschermen en keuzeonderdelen kort met vervaging en verticale beweging; op het volledige bevestigingsscherm verschijnen ook de boodschap en bediening in volgorde. De inhoud en eindposities blijven gelijk. Er is geen extra wachttijd in deze vergelijking. Bij een ingestelde voorkeur voor minder beweging zijn de animaties uitgeschakeld.</w:t>
+        <w:t>De taak is een afspraak plannen en herkennen wanneer de boeking is voltooid. De schakelaar Animatie bestuurt alle micro-interacties op de deelnemerssite. In variant A zijn scherm- en onderdeelanimaties, hoverfeedback, ingedrukte knopfeedback, kleurtransities en de bewegende glans van skeletonschermen uitgeschakeld. In variant B zijn deze micro-interacties ingeschakeld: GSAP laat schermen en keuzeonderdelen kort verschijnen met vervaging en verticale beweging, en knoppen reageren visueel op aanwijzen en indrukken. Grotere tekst, zichtbare navigatie, hoog contrast, skeletonschermen en de nadruk op hoofdacties blijven in beide varianten aan. Een skeleton is in A dus zichtbaar maar stilstaand. Gekozen opties, niet-beschikbare knoppen, toetsenbordfocus en de blijvende bevestiging blijven herkenbaar in beide varianten. Iedere schermovergang heeft dezelfde laadvertraging van 1,4 seconde; micro-interacties voegen geen extra laadvertraging toe. De apparaatvoorkeur voor minder beweging wordt gerespecteerd.</w:t>
       </w:r>
     </w:p>
     <w:p>
@@ -10149,7 +10149,7 @@
         <w:spacing w:after="120"/>
       </w:pPr>
       <w:r>
-        <w:t>De tekst, eindpositie en verdere bediening zijn gelijk. We vergelijken hoe de route en dezelfde boekingsbevestiging worden waargenomen. Naast de gemeenschappelijke metingen registreren we herhaald drukken op Afspraak bevestigen en twijfel over de afloop. We vragen na afloop neutraal wat duidelijk of onduidelijk was. Duur, volgorde en bewegingscurve zijn te toetsen ontwerpkeuzes, geen bewezen optimale instellingen voor ouderen.</w:t>
+        <w:t>De tekst, eindposities en functies zijn gelijk. Deze vergelijking meet de gezamenlijke bijdrage van micro-interacties, inclusief tijdelijke knopfeedback; een uitkomst kan niet uitsluitend aan de bevestigingsanimatie worden toegeschreven. Naast de gemeenschappelijke metingen registreren we herhaald drukken op Afspraak bevestigen en twijfel over de afloop. We vragen na afloop neutraal wat duidelijk of onduidelijk was. Duur, volgorde en bewegingscurve zijn te toetsen ontwerpkeuzes, geen bewezen optimale instellingen voor ouderen.</w:t>
       </w:r>
     </w:p>
     <w:p>
@@ -10167,39 +10167,82 @@
         <w:spacing w:after="120"/>
       </w:pPr>
       <w:r>
-        <w:t>Het vijfde taakpaar gebruikt opnieuw de volledige boekingsroute. Variant A combineert de basiseigenschappen uit de afzonderlijke vergelijkingen. Variant B combineert grotere tekst, zichtbare navigatie, hoger tekstcontrast en de functionele GSAP-animaties. In B krijgt de belangrijkste vervolgstap bovendien meer visuele nadruk door een herkenbare hoofdknop en groepering van bijbehorende informatie.</w:t>
+        <w:t>Het vijfde taakpaar vergelijkt het volledige basisontwerp met het volledig aangepaste ontwerp. In variant A zijn alle vijf schakelaars uit: kleinere tekst, navigatie achter Menu, laag contrast, geen micro-interacties en geen skeletonscherm. In variant B staan alle vijf schakelaars aan: grotere tekst en koppen, zichtbare navigatie, hoog contrast, micro-interacties en skeletonschermen. In B krijgt de belangrijkste vervolgstap bovendien meer visuele nadruk door een herkenbare hoofdknop en groepering van bijbehorende informatie. Beide varianten gebruiken dezelfde laadvertraging van 1,4 seconde per schermovergang. Dit taakpaar is de uitzondering op de regel dat in A slechts één kenmerk uitstaat.</w:t>
       </w:r>
     </w:p>
     <w:p>
       <w:pPr>
         <w:spacing w:after="120"/>
       </w:pPr>
+      <w:r>
+        <w:t>Binnen een A/B-paar blijven de aangeboden diensten, alle boekbare werkdagen, tijden, route en vormgeving buiten het onderzochte kenmerk gelijk. De doeldata van de vier opdrachtversies van hetzelfde paar vallen in dezelfde maand; de specifieke afspraakgegevens verschillen. Deze vergelijking laat zien hoe het pakket van aanpassingen bij dezelfde soort boekingstaak uitpakt. Een voordeel kan niet aan één kenmerk worden toegeschreven. De vijf deelvergelijkingen helpen bij de uitleg van het totaalresultaat.</w:t>
+      </w:r>
+    </w:p>
+    <w:p>
+      <w:pPr>
+        <w:pStyle w:val="Kop3"/>
+      </w:pPr>
+      <w:r>
+        <w:t>4.3.6 Geduld bij laden</w:t>
+      </w:r>
+    </w:p>
+    <w:p>
+      <w:pPr/>
+      <w:r>
+        <w:t>Het zesde taakpaar vergelijkt het volledig aangepaste ontwerp zonder skeletonscherm (A) met hetzelfde ontwerp met skeletonscherm (B). Grotere tekst, zichtbare navigatie, hoog contrast, micro-interacties en de nadruk op hoofdacties blijven in beide varianten aan. Bij iedere schermovergang duurt de kunstmatige vertraging 1,4 seconde. In A blijft de huidige pagina onveranderd zichtbaar, zonder waas, blur of andere laadfeedback; in B verschijnt een skeletonscherm met de globale opbouw van de volgende pagina en een bewegende glans. Het aantal en de duur van de vertragingen zijn gelijk. We registreren of de deelnemer doorgaat, de ervaren wachttijd, frustratie, onzekerheid en opmerkingen over de voortgang. De vergelijking betreft deze twee vormen van laadfeedback binnen het aangepaste ontwerp.</w:t>
+      </w:r>
+    </w:p>
+    <w:p>
+      <w:pPr>
+        <w:pStyle w:val="Kop3"/>
+      </w:pPr>
+      <w:r>
+        <w:t>4.3.7 Hulpmiddelen en grenzen van het prototype</w:t>
+      </w:r>
+    </w:p>
+    <w:p>
+      <w:pPr>
+        <w:spacing w:after="120"/>
+      </w:pPr>
+      <w:r>
+        <w:rPr>
+          <w:rFonts w:ascii="Cambria" w:hAnsi="Cambria"/>
+        </w:rPr>
+      </w:r>
+      <w:r>
+        <w:t>Deelnemers mogen hun gebruikelijke bril dragen. Wie normaal vergrote tekst nodig heeft, krijgt vooraf een vaste vergrotingsinstelling van 100%, 125%, 150% of 200% die tijdens alle vergelijkingen gelijk blijft. We leggen deze instelling, browserzoom en eventuele systeeminstelling vast. We controleren in de proeftest of de werkende webapp leesbaar en bedienbaar blijft, inclusief tekstterugloop en kalender.</w:t>
+      </w:r>
+    </w:p>
+    <w:p>
+      <w:pPr>
+        <w:spacing w:after="120"/>
+      </w:pPr>
       <w:r/>
       <w:r>
-        <w:t>Binnen een A/B-paar blijven de aangeboden diensten, alle boekbare werkdagen, tijden, route en vormgeving buiten het onderzochte kenmerk gelijk. De doeldata van de vier opdrachtversies van hetzelfde paar vallen in dezelfde maand; de specifieke afspraakgegevens verschillen. Deze vergelijking laat zien hoe het pakket van aanpassingen bij dezelfde soort boekingstaak uitpakt. Een voordeel kan niet aan één kenmerk worden toegeschreven. De vier deelvergelijkingen helpen bij de uitleg van het totaalresultaat.</w:t>
-      </w:r>
-    </w:p>
-    <w:p>
-      <w:pPr>
-        <w:pStyle w:val="Kop3"/>
-      </w:pPr>
-      <w:r>
-        <w:t>4.3.6 Geduld bij laden</w:t>
+        <w:t>We gebruiken een werkende webapp met fictieve diensten en tijdstippen. De kalender laat zes opeenvolgende maanden zien, van oktober 2026 tot en met maart 2027; binnen dit bereik zijn alle maandag- tot en met vrijdagen selecteerbaar en weekenden niet. Ook verkeerde, zichtbare boekingskeuzes reageren en kunnen via Terug of de controlepagina worden hersteld. Een niet-werkende koppeling is een prototypefout. Schermlezers en volledige technische toegankelijkheid vallen buiten de meting.</w:t>
       </w:r>
     </w:p>
     <w:p>
       <w:pPr/>
       <w:r>
-        <w:t>Het zesde taakpaar gebruikt dezelfde boekingsroute, tekst, opties en objectieve wachttijd in A en B. Bij iedere schermovergang duurt de kunstmatige vertraging 1,4 seconde. In A ziet de deelnemer tijdens die periode alleen een leeg, crèmekleurig scherm; in B een skeletonscherm dat de globale opbouw van de volgende pagina aanduidt. Het aantal en de duur van de vertragingen zijn gelijk. We registreren of de deelnemer doorgaat, de ervaren wachttijd, frustratie, onzekerheid en opmerkingen over de voortgang. Het verschil kan daardoor worden toegeschreven aan de zichtbare terugkoppeling, binnen de grenzen van deze proefopzet.</w:t>
-      </w:r>
-    </w:p>
-    <w:p>
-      <w:pPr>
-        <w:pStyle w:val="Kop3"/>
-      </w:pPr>
-      <w:r>
-        <w:t>4.3.7 Hulpmiddelen en grenzen van het prototype</w:t>
-      </w:r>
+        <w:t>De publieke homepage toont een directe afspraakknop, vijf zorggebieden, praktische informatie en beeldkaarten. Via het hoofdmenu, de zoekbalk, het kruimelpad, verwante links en de footer zijn onder meer locaties, tarieven, veelgestelde vragen, energiemanagement en groepsbewegen bereikbaar. Het desktopmenu opent bij aanwijzen of toetsenbordfocus; het mobiele menu vult de beschikbare schermhoogte. Foto's van therapie, bewegen, de praktijk en groepsactiviteiten geven de site meer visuele variatie. Andere inhoudspagina's kunnen als geloofwaardige omweg afleiden van een boeking.</w:t>
+      </w:r>
+    </w:p>
+    <w:p>
+      <w:pPr/>
+      <w:r>
+        <w:t>De vier verkennende informatievragen gaan over energiemanagement, de voorbeeldlocatie, het fictieve karakter van een afspraak en de doelgroep van groepsbewegen. Per deelnemer staan twee van deze vier vragen in het vooraf vastgelegde rooster, na het tweede en vierde boekingspaar. Een vijfde extra opdracht na het zesde paar vraagt de deelnemer in te loggen met het vooraf op de opdrachtkaart gegeven fictieve adres alex.voorbeeld@example.invalid. Het prototype verzendt geen e-mail en maakt geen echt account aan. We leggen de juiste pagina en het verwachte antwoord vooraf vast en analyseren deze drie extra taken afzonderlijk van de boekingsvergelijkingen.</w:t>
+      </w:r>
+    </w:p>
+    <w:p>
+      <w:pPr>
+        <w:pStyle w:val="Kop2"/>
+      </w:pPr>
+      <w:bookmarkStart w:id="67" w:name="_Toc240533833"/>
+      <w:r>
+        <w:t>4.4 Onderzoeksverloop</w:t>
+      </w:r>
+      <w:bookmarkEnd w:id="67"/>
     </w:p>
     <w:p>
       <w:pPr>
@@ -10209,9 +10252,7 @@
         <w:rPr>
           <w:rFonts w:ascii="Cambria" w:hAnsi="Cambria"/>
         </w:rPr>
-      </w:r>
-      <w:r>
-        <w:t>Deelnemers mogen hun gebruikelijke bril dragen. Wie normaal vergrote tekst nodig heeft, krijgt vooraf een vaste vergrotingsinstelling van 100%, 125%, 150% of 200% die tijdens alle vergelijkingen gelijk blijft. We leggen deze instelling, browserzoom en eventuele systeeminstelling vast. We controleren in de proeftest of de werkende webapp leesbaar en bedienbaar blijft, inclusief tekstterugloop en kalender.</w:t>
+        <w:t>In de eerste week ontwerpen we de schermen, schrijven we de opdrachten en werven we deelnemers. We voeren een proeftest uit met twee of drie ouderen die niet aan de hoofdmeting deelnemen. Daarin controleren we de begrijpelijkheid, vergelijkbaarheid en duur van de opdrachten, de vergroting en de opnames. In week twee en drie voeren we de hoofdmeting uit. Week vier gebruiken we voor analyse en verslaglegging.</w:t>
       </w:r>
     </w:p>
     <w:p>
@@ -10220,40 +10261,61 @@
       </w:pPr>
       <w:r/>
       <w:r>
-        <w:t>We gebruiken een werkende webapp met fictieve diensten en tijdstippen. De kalender laat zes opeenvolgende maanden zien, van oktober 2026 tot en met maart 2027; binnen dit bereik zijn alle maandag- tot en met vrijdagen selecteerbaar en weekenden niet. Ook verkeerde, zichtbare boekingskeuzes reageren en kunnen via Terug of de controlepagina worden hersteld. Een niet-werkende koppeling is een prototypefout. Schermlezers en volledige technische toegankelijkheid vallen buiten de meting.</w:t>
-      </w:r>
-    </w:p>
-    <w:p>
-      <w:pPr/>
-      <w:r>
-        <w:t>De publieke homepage toont een directe afspraakknop, vijf zorggebieden, praktische informatie en beeldkaarten. Via het hoofdmenu, de zoekbalk, het kruimelpad, verwante links en de footer zijn onder meer locaties, tarieven, veelgestelde vragen, energiemanagement en groepsbewegen bereikbaar. Het desktopmenu opent bij aanwijzen of toetsenbordfocus; het mobiele menu vult de beschikbare schermhoogte. Foto's van therapie, bewegen, de praktijk en groepsactiviteiten geven de site meer visuele variatie. Andere inhoudspagina's kunnen als geloofwaardige omweg afleiden van een boeking.</w:t>
-      </w:r>
-    </w:p>
-    <w:p>
-      <w:pPr/>
-      <w:r>
-        <w:t>De vier verkennende informatievragen gaan over energiemanagement, de voorbeeldlocatie, het fictieve karakter van een afspraak en de doelgroep van groepsbewegen. Per deelnemer staan twee van deze vier vragen in het vooraf vastgelegde rooster, na het tweede en vierde boekingspaar. Een vijfde extra opdracht na het zesde paar vraagt de deelnemer in te loggen met het vooraf op de opdrachtkaart gegeven fictieve adres alex.voorbeeld@example.invalid. Het prototype verzendt geen e-mail en maakt geen echt account aan. We leggen de juiste pagina en het verwachte antwoord vooraf vast en analyseren deze drie extra taken afzonderlijk van de boekingsvergelijkingen.</w:t>
+        <w:t>Per taakpaar maken we vier inhoudsversies, X, Y, Z en W, met verschillende fictieve diensten, datums en tijden. Binnen één paar liggen alle doeldata in dezelfde maand en blijft het hele kalenderaanbod gelijk. Ook tussen taakparen herhalen we geen exact afspraakscenario. We verdelen acht combinaties van A/B-volgorde en inhoudsversies zo gelijk mogelijk binnen beide apparaatgroepen. De vooraf vastgelegde versie blijft gedurende een taak actief op alle schermen van de site.</w:t>
+      </w:r>
+    </w:p>
+    <w:p>
+      <w:pPr>
+        <w:spacing w:after="120"/>
+      </w:pPr>
+      <w:r>
+        <w:t>Ook de volgorde van de zes vergelijkingen wisselen we af. We gebruiken zes cyclische volgordes, telkens een verschuiving van 1-2-3-4-5-6. Binnen beide apparaatgroepen delen we deze zo gelijk mogelijk uit. Vooraf leggen we per deelnemercode de volledige volgorde vast. Het twaalfmaal doorlopen van dezelfde route kan alsnog leer- en vermoeidheidseffecten geven; die bespreken we bij de interpretatie.</w:t>
+      </w:r>
+    </w:p>
+    <w:p>
+      <w:pPr>
+        <w:spacing w:after="120"/>
+      </w:pPr>
+      <w:r>
+        <w:t>De totale sessieduur, inclusief vijftien taken, schaalvragen en pauzes, bepalen we in de proeftest. We leggen uit dat we het ontwerp onderzoeken en dat vastlopen geen oordeel over de deelnemer is. Daarna verzamelen we achtergrondgegevens en laten we kort zien hoe tikken of klikken werkt, zonder een boeking, zoekopdracht of inlogopdracht voor te doen.</w:t>
+      </w:r>
+    </w:p>
+    <w:p>
+      <w:pPr>
+        <w:spacing w:after="120"/>
+      </w:pPr>
+      <w:r/>
+      <w:r>
+        <w:t>We lezen bij iedere boeking de gevraagde dienst, datum en tijd op dezelfde manier voor; de opdracht blijft daarnaast leesbaar beschikbaar buiten de deelnemerssite. Bij twee extra taken lezen we een korte zoekvraag voor en vragen we de deelnemer een antwoord op de site te vinden, zonder een afspraak te boeken. De deelnemer vertelt wat hij of zij zoekt of onduidelijk vindt. We geven tijdens de meting geen hints. Na iedere taak volgen twee korte schaalvragen. Na het tweede en vierde boekingspaar bieden we een pauze aan, en eerder als iemand dat nodig heeft.</w:t>
+      </w:r>
+    </w:p>
+    <w:p>
+      <w:pPr>
+        <w:spacing w:after="120"/>
+      </w:pPr>
+      <w:r>
+        <w:rPr>
+          <w:rFonts w:ascii="Cambria" w:hAnsi="Cambria"/>
+        </w:rPr>
+        <w:t>Meestal zijn wij beiden aanwezig: één begeleidt de sessie en één registreert en timet. Als slechts één onderzoeker aanwezig is, controleert de ander de registratie achteraf met de opname. We testen waar mogelijk in een rustige ruimte zonder meedenkende familieleden. Afwijkingen, onderbrekingen en wisselingen van begeleider noteren we.</w:t>
       </w:r>
     </w:p>
     <w:p>
       <w:pPr>
         <w:pStyle w:val="Kop2"/>
       </w:pPr>
-      <w:bookmarkStart w:id="67" w:name="_Toc240533833"/>
-      <w:r>
-        <w:t>4.4 Onderzoeksverloop</w:t>
-      </w:r>
-      <w:bookmarkEnd w:id="67"/>
+      <w:bookmarkStart w:id="68" w:name="_Toc240533834"/>
+      <w:r>
+        <w:t>4.5 Dataverzameling en datakenmerken</w:t>
+      </w:r>
+      <w:bookmarkEnd w:id="68"/>
     </w:p>
     <w:p>
       <w:pPr>
         <w:spacing w:after="120"/>
       </w:pPr>
       <w:r>
-        <w:rPr>
-          <w:rFonts w:ascii="Cambria" w:hAnsi="Cambria"/>
-        </w:rPr>
-        <w:t>In de eerste week ontwerpen we de schermen, schrijven we de opdrachten en werven we deelnemers. We voeren een proeftest uit met twee of drie ouderen die niet aan de hoofdmeting deelnemen. Daarin controleren we de begrijpelijkheid, vergelijkbaarheid en duur van de opdrachten, de vergroting en de opnames. In week twee en drie voeren we de hoofdmeting uit. Week vier gebruiken we voor analyse en verslaglegging.</w:t>
+        <w:t>Per taakuitvoering leggen we de deelnemercode, het apparaat, taaknummer, taaksoort, volgorde en vergrotingsinstelling vast. Voor boekingen registreren we ook taakpaar, ontwerpvariant en inhoudsversie; voor extra taken de zoek- of inlogvraag, bezochte pagina's en het gegeven antwoord. Een rij staat voor een uitgevoerde taak. Bij 25 volledige sessies zijn dat maximaal 375 taakregistraties: 300 boekingen, 50 informatieopdrachten en 25 inlogopdrachten. Dit zijn herhaalde metingen bij 25 personen, geen onafhankelijke deelnemers.</w:t>
       </w:r>
     </w:p>
     <w:p>
@@ -10262,7 +10324,7 @@
       </w:pPr>
       <w:r/>
       <w:r>
-        <w:t>Per taakpaar maken we vier inhoudsversies, X, Y, Z en W, met verschillende fictieve diensten, datums en tijden. Binnen één paar liggen alle doeldata in dezelfde maand en blijft het hele kalenderaanbod gelijk. Ook tussen taakparen herhalen we geen exact afspraakscenario. We verdelen acht combinaties van A/B-volgorde en inhoudsversies zo gelijk mogelijk binnen beide apparaatgroepen. De vooraf vastgelegde versie blijft gedurende een taak actief op alle schermen van de site.</w:t>
+        <w:t>Zelfstandig slagen registreren we als ja of nee. Een boeking slaagt als de deelnemer binnen maximaal drie minuten zonder inhoudelijke hulp de gevraagde dienst, datum en tijd kiest en de bevestiging “Afspraak geboekt” bereikt. Zelfstandig herstelde fouten sluiten slagen niet uit. Voor iedere inhoudsversie leggen we de juiste combinatie vooraf vast. Bij een siteopdracht noteren we afzonderlijk of de deelnemer binnen drie minuten de bedoelde informatiepagina bereikt en het vooraf vastgelegde antwoord geeft. Deze uitkomst telt niet mee als boekingssucces.</w:t>
       </w:r>
     </w:p>
     <w:p>
@@ -10270,7 +10332,10 @@
         <w:spacing w:after="120"/>
       </w:pPr>
       <w:r>
-        <w:t>Ook de volgorde van de zes vergelijkingen wisselen we af. We gebruiken zes cyclische volgordes, telkens een verschuiving van 1-2-3-4-5-6. Binnen beide apparaatgroepen delen we deze zo gelijk mogelijk uit. Vooraf leggen we per deelnemercode de volledige volgorde vast. Het twaalfmaal doorlopen van dezelfde route kan alsnog leer- en vermoeidheidseffecten geven; die bespreken we bij de interpretatie.</w:t>
+        <w:rPr>
+          <w:rFonts w:ascii="Cambria" w:hAnsi="Cambria"/>
+        </w:rPr>
+        <w:t>De tijd start zodra de opdracht is voorgelezen en het startscherm beschikbaar is. De tijd stopt bij het einddoel, opgeven, de tijdgrens of beëindiging wegens hulp. We registreren seconden en de reden van stoppen. Een deelnemer mag de opdracht opnieuw laten voorlezen; dat telt niet als inhoudelijke hulp en de tijd loopt door. Bij een hulpvraag geven we geen aanwijzing. Als de deelnemer zonder hulp niet verder wil of kan, eindigt de taak als niet zelfstandig geslaagd.</w:t>
       </w:r>
     </w:p>
     <w:p>
@@ -10278,16 +10343,18 @@
         <w:spacing w:after="120"/>
       </w:pPr>
       <w:r>
-        <w:t>De totale sessieduur, inclusief vijftien taken, schaalvragen en pauzes, bepalen we in de proeftest. We leggen uit dat we het ontwerp onderzoeken en dat vastlopen geen oordeel over de deelnemer is. Daarna verzamelen we achtergrondgegevens en laten we kort zien hoe tikken of klikken werkt, zonder een boeking, zoekopdracht of inlogopdracht voor te doen.</w:t>
+        <w:t>Als fout tellen we een onjuiste dienst, datum of tijd, een verkeerde boekingsstap of een onterechte of herhaalde bevestiging. We leggen vooraf concrete foutcodes vast. Het openen van het bedoelde menu, nodig scrollen of een toegestane alternatieve route telt niet als fout. Herhaalde verkeerde acties tellen afzonderlijk. Zelfcorrectie en hulpvragen registreren we apart.</w:t>
       </w:r>
     </w:p>
     <w:p>
       <w:pPr>
         <w:spacing w:after="120"/>
       </w:pPr>
-      <w:r/>
-      <w:r>
-        <w:t>We lezen bij iedere boeking de gevraagde dienst, datum en tijd op dezelfde manier voor; de opdracht blijft daarnaast leesbaar beschikbaar buiten de deelnemerssite. Bij twee extra taken lezen we een korte zoekvraag voor en vragen we de deelnemer een antwoord op de site te vinden, zonder een afspraak te boeken. De deelnemer vertelt wat hij of zij zoekt of onduidelijk vindt. We geven tijdens de meting geen hints. Na iedere taak volgen twee korte schaalvragen. Na het tweede en vierde boekingspaar bieden we een pauze aan, en eerder als iemand dat nodig heeft.</w:t>
+      <w:r>
+        <w:rPr>
+          <w:rFonts w:ascii="Cambria" w:hAnsi="Cambria"/>
+        </w:rPr>
+        <w:t>Na iedere variant vragen we: ‘Hoeveel frustratie of ergernis voelde u tijdens deze opdracht?’ en ‘Hoe onzeker voelde u zich over wat u moest doen of over of het gelukt was?’ Beide vragen gebruiken dezelfde schaal: 1 = helemaal niet, 2 = weinig, 3 = matig, 4 = veel en 5 = heel veel. We vragen dit ook na een niet-geslaagde taak. Dit zijn twee afzonderlijke ordinale beoordelingen; we voegen ze niet samen tot één toegankelijkheidsscore.</w:t>
       </w:r>
     </w:p>
     <w:p>
@@ -10298,34 +10365,44 @@
         <w:rPr>
           <w:rFonts w:ascii="Cambria" w:hAnsi="Cambria"/>
         </w:rPr>
-        <w:t>Meestal zijn wij beiden aanwezig: één begeleidt de sessie en één registreert en timet. Als slechts één onderzoeker aanwezig is, controleert de ander de registratie achteraf met de opname. We testen waar mogelijk in een rustige ruimte zonder meedenkende familieleden. Afwijkingen, onderbrekingen en wisselingen van begeleider noteren we.</w:t>
+        <w:t>We maken met toestemming een schermopname en een opname van gezicht en stem. Een gezamenlijk startsignaal helpt om de opnames naast elkaar te leggen. We timen ook handmatig en controleren onduidelijke tijden op de schermopname. Uitspraken en zichtbaar gedrag gebruiken we als aanvullende observaties. Een gezichtsuitdrukking op zichzelf bewijst geen frustratie of onzekerheid; daarvoor blijven de antwoorden van de deelnemer leidend. De gezichtsopname is ook geen meting van oogbewegingen.</w:t>
+      </w:r>
+    </w:p>
+    <w:p>
+      <w:pPr>
+        <w:spacing w:after="120"/>
+      </w:pPr>
+      <w:r>
+        <w:t>Aan het einde vragen we welke versies van de boekingsroute makkelijker of moeilijker waren, wat daarbij hielp en welke aanpassing de deelnemer zelf zou willen behouden. De kwantitatieve gegevens bestaan uit categorieën, aantallen, tijden en ordinale scores. De kwalitatieve gegevens bestaan uit uitspraken, beschrijvingen van gedrag en antwoorden uit dit nagesprek.</w:t>
       </w:r>
     </w:p>
     <w:p>
       <w:pPr>
         <w:pStyle w:val="Kop2"/>
       </w:pPr>
-      <w:bookmarkStart w:id="68" w:name="_Toc240533834"/>
-      <w:r>
-        <w:t>4.5 Dataverzameling en datakenmerken</w:t>
-      </w:r>
-      <w:bookmarkEnd w:id="68"/>
+      <w:bookmarkStart w:id="69" w:name="_Toc240533835"/>
+      <w:r>
+        <w:t>4.6 Data-analyse</w:t>
+      </w:r>
+      <w:bookmarkEnd w:id="69"/>
     </w:p>
     <w:p>
       <w:pPr>
         <w:spacing w:after="120"/>
       </w:pPr>
       <w:r>
-        <w:t>Per taakuitvoering leggen we de deelnemercode, het apparaat, taaknummer, taaksoort, volgorde en vergrotingsinstelling vast. Voor boekingen registreren we ook taakpaar, ontwerpvariant en inhoudsversie; voor extra taken de zoek- of inlogvraag, bezochte pagina's en het gegeven antwoord. Een rij staat voor een uitgevoerde taak. Bij 25 volledige sessies zijn dat maximaal 375 taakregistraties: 300 boekingen, 50 informatieopdrachten en 25 inlogopdrachten. Dit zijn herhaalde metingen bij 25 personen, geen onafhankelijke deelnemers.</w:t>
+        <w:t>We analyseren in Excel de zes boekingsvergelijkingen eerst apart voor smartphone en desktop. Per taakpaar vergelijken we A en B binnen dezelfde deelnemer. Voor zelfstandig slagen tonen we aantallen en percentages met het aantal geldige metingen. We vermelden hoeveel deelnemers beide varianten halen, alleen A, alleen B of geen van beide. Het verschil in succespercentage drukken we uit in procentpunten. Voor test 6 vergelijken we daarnaast de waargenomen wachttijd, onzekerheid, frustratie en het al dan niet doorgaan, terwijl de feitelijke vertraging gelijk blijft. De informatie- en inlogopdrachten beschrijven we apart; ze krijgen geen gepaarde A/B-effectschatting.</w:t>
       </w:r>
     </w:p>
     <w:p>
       <w:pPr>
         <w:spacing w:after="120"/>
       </w:pPr>
-      <w:r/>
-      <w:r>
-        <w:t>Zelfstandig slagen registreren we als ja of nee. Een boeking slaagt als de deelnemer binnen maximaal drie minuten zonder inhoudelijke hulp de gevraagde dienst, datum en tijd kiest en de bevestiging “Afspraak geboekt” bereikt. Zelfstandig herstelde fouten sluiten slagen niet uit. Voor iedere inhoudsversie leggen we de juiste combinatie vooraf vast. Bij een siteopdracht noteren we afzonderlijk of de deelnemer binnen drie minuten de bedoelde informatiepagina bereikt en het vooraf vastgelegde antwoord geeft. Deze uitkomst telt niet mee als boekingssucces.</w:t>
+      <w:r>
+        <w:rPr>
+          <w:rFonts w:ascii="Cambria" w:hAnsi="Cambria"/>
+        </w:rPr>
+        <w:t>Voor frustratie en onzekerheid tonen we per variant de verdeling over de vijf antwoordcategorieën en de mediaan. Daarnaast tellen we hoeveel deelnemers B lager, gelijk of hoger beoordelen dan A. We bespreken beide gevoelens afzonderlijk, ook wanneer ze verschillend reageren op dezelfde aanpassing.</w:t>
       </w:r>
     </w:p>
     <w:p>
@@ -10336,7 +10413,7 @@
         <w:rPr>
           <w:rFonts w:ascii="Cambria" w:hAnsi="Cambria"/>
         </w:rPr>
-        <w:t>De tijd start zodra de opdracht is voorgelezen en het startscherm beschikbaar is. De tijd stopt bij het einddoel, opgeven, de tijdgrens of beëindiging wegens hulp. We registreren seconden en de reden van stoppen. Een deelnemer mag de opdracht opnieuw laten voorlezen; dat telt niet als inhoudelijke hulp en de tijd loopt door. Bij een hulpvraag geven we geen aanwijzing. Als de deelnemer zonder hulp niet verder wil of kan, eindigt de taak als niet zelfstandig geslaagd.</w:t>
+        <w:t>Taakduur vergelijken we aanvullend bij deelnemers die beide varianten van een taakpaar zelfstandig afronden. We rapporteren de mediane tijd per variant en de mediaan van de individuele tijdsverschillen. Bij mislukte taken is de tijd tot stoppen geen succesvolle voltooiingstijd; we bespreken die apart. Het aantal fouten en de soort fouten helpen om te verklaren waar deelnemers vastlopen. Hardop denken beïnvloedt de tijd, waardoor onze tijden ook de gekozen testprocedure weerspiegelen.</w:t>
       </w:r>
     </w:p>
     <w:p>
@@ -10344,7 +10421,10 @@
         <w:spacing w:after="120"/>
       </w:pPr>
       <w:r>
-        <w:t>Als fout tellen we een onjuiste dienst, datum of tijd, een verkeerde boekingsstap of een onterechte of herhaalde bevestiging. We leggen vooraf concrete foutcodes vast. Het openen van het bedoelde menu, nodig scrollen of een toegestane alternatieve route telt niet als fout. Herhaalde verkeerde acties tellen afzonderlijk. Zelfcorrectie en hulpvragen registreren we apart.</w:t>
+        <w:rPr>
+          <w:rFonts w:ascii="Cambria" w:hAnsi="Cambria"/>
+        </w:rPr>
+        <w:t>Voor observaties gebruiken we voorlopige categorieën zoals leesproblemen, zoeken naar navigatie, onduidelijke feedback en problemen door afbreken of scrollen. We voegen een categorie toe als terugkerende opmerkingen daar niet onder passen. We koppelen observaties en korte citaten aan de juiste taakvariant. We beoordelen vijf complete sessies onafhankelijk van elkaar op foutcodes en observatiecategorieën. Verschillen bespreken we; bij aangescherpte definities controleren we ook eerder verwerkte sessies opnieuw.</w:t>
       </w:r>
     </w:p>
     <w:p>
@@ -10352,91 +10432,7 @@
         <w:spacing w:after="120"/>
       </w:pPr>
       <w:r>
-        <w:rPr>
-          <w:rFonts w:ascii="Cambria" w:hAnsi="Cambria"/>
-        </w:rPr>
-        <w:t>Na iedere variant vragen we: ‘Hoeveel frustratie of ergernis voelde u tijdens deze opdracht?’ en ‘Hoe onzeker voelde u zich over wat u moest doen of over of het gelukt was?’ Beide vragen gebruiken dezelfde schaal: 1 = helemaal niet, 2 = weinig, 3 = matig, 4 = veel en 5 = heel veel. We vragen dit ook na een niet-geslaagde taak. Dit zijn twee afzonderlijke ordinale beoordelingen; we voegen ze niet samen tot één toegankelijkheidsscore.</w:t>
-      </w:r>
-    </w:p>
-    <w:p>
-      <w:pPr>
-        <w:spacing w:after="120"/>
-      </w:pPr>
-      <w:r>
-        <w:rPr>
-          <w:rFonts w:ascii="Cambria" w:hAnsi="Cambria"/>
-        </w:rPr>
-        <w:t>We maken met toestemming een schermopname en een opname van gezicht en stem. Een gezamenlijk startsignaal helpt om de opnames naast elkaar te leggen. We timen ook handmatig en controleren onduidelijke tijden op de schermopname. Uitspraken en zichtbaar gedrag gebruiken we als aanvullende observaties. Een gezichtsuitdrukking op zichzelf bewijst geen frustratie of onzekerheid; daarvoor blijven de antwoorden van de deelnemer leidend. De gezichtsopname is ook geen meting van oogbewegingen.</w:t>
-      </w:r>
-    </w:p>
-    <w:p>
-      <w:pPr>
-        <w:spacing w:after="120"/>
-      </w:pPr>
-      <w:r>
-        <w:t>Aan het einde vragen we welke versies van de boekingsroute makkelijker of moeilijker waren, wat daarbij hielp en welke aanpassing de deelnemer zelf zou willen behouden. De kwantitatieve gegevens bestaan uit categorieën, aantallen, tijden en ordinale scores. De kwalitatieve gegevens bestaan uit uitspraken, beschrijvingen van gedrag en antwoorden uit dit nagesprek.</w:t>
-      </w:r>
-    </w:p>
-    <w:p>
-      <w:pPr>
-        <w:pStyle w:val="Kop2"/>
-      </w:pPr>
-      <w:bookmarkStart w:id="69" w:name="_Toc240533835"/>
-      <w:r>
-        <w:t>4.6 Data-analyse</w:t>
-      </w:r>
-      <w:bookmarkEnd w:id="69"/>
-    </w:p>
-    <w:p>
-      <w:pPr>
-        <w:spacing w:after="120"/>
-      </w:pPr>
-      <w:r>
-        <w:t>We analyseren in Excel de zes boekingsvergelijkingen eerst apart voor smartphone en desktop. Per taakpaar vergelijken we A en B binnen dezelfde deelnemer. Voor zelfstandig slagen tonen we aantallen en percentages met het aantal geldige metingen. We vermelden hoeveel deelnemers beide varianten halen, alleen A, alleen B of geen van beide. Het verschil in succespercentage drukken we uit in procentpunten. Voor test 6 vergelijken we daarnaast de waargenomen wachttijd, onzekerheid, frustratie en het al dan niet doorgaan, terwijl de feitelijke vertraging gelijk blijft. De informatie- en inlogopdrachten beschrijven we apart; ze krijgen geen gepaarde A/B-effectschatting.</w:t>
-      </w:r>
-    </w:p>
-    <w:p>
-      <w:pPr>
-        <w:spacing w:after="120"/>
-      </w:pPr>
-      <w:r>
-        <w:rPr>
-          <w:rFonts w:ascii="Cambria" w:hAnsi="Cambria"/>
-        </w:rPr>
-        <w:t>Voor frustratie en onzekerheid tonen we per variant de verdeling over de vijf antwoordcategorieën en de mediaan. Daarnaast tellen we hoeveel deelnemers B lager, gelijk of hoger beoordelen dan A. We bespreken beide gevoelens afzonderlijk, ook wanneer ze verschillend reageren op dezelfde aanpassing.</w:t>
-      </w:r>
-    </w:p>
-    <w:p>
-      <w:pPr>
-        <w:spacing w:after="120"/>
-      </w:pPr>
-      <w:r>
-        <w:rPr>
-          <w:rFonts w:ascii="Cambria" w:hAnsi="Cambria"/>
-        </w:rPr>
-        <w:t>Taakduur vergelijken we aanvullend bij deelnemers die beide varianten van een taakpaar zelfstandig afronden. We rapporteren de mediane tijd per variant en de mediaan van de individuele tijdsverschillen. Bij mislukte taken is de tijd tot stoppen geen succesvolle voltooiingstijd; we bespreken die apart. Het aantal fouten en de soort fouten helpen om te verklaren waar deelnemers vastlopen. Hardop denken beïnvloedt de tijd, waardoor onze tijden ook de gekozen testprocedure weerspiegelen.</w:t>
-      </w:r>
-    </w:p>
-    <w:p>
-      <w:pPr>
-        <w:spacing w:after="120"/>
-      </w:pPr>
-      <w:r>
-        <w:rPr>
-          <w:rFonts w:ascii="Cambria" w:hAnsi="Cambria"/>
-        </w:rPr>
-        <w:t>Voor observaties gebruiken we voorlopige categorieën zoals leesproblemen, zoeken naar navigatie, onduidelijke feedback en problemen door afbreken of scrollen. We voegen een categorie toe als terugkerende opmerkingen daar niet onder passen. We koppelen observaties en korte citaten aan de juiste taakvariant. We beoordelen vijf complete sessies onafhankelijk van elkaar op foutcodes en observatiecategorieën. Verschillen bespreken we; bij aangescherpte definities controleren we ook eerder verwerkte sessies opnieuw.</w:t>
-      </w:r>
-    </w:p>
-    <w:p>
-      <w:pPr>
-        <w:spacing w:after="120"/>
-      </w:pPr>
-      <w:r>
-        <w:rPr>
-          <w:rFonts w:ascii="Cambria" w:hAnsi="Cambria"/>
-        </w:rPr>
-        <w:t>We beantwoorden de hoofdvraag met de volledige ontwerpvergelijking en gebruiken de vier afzonderlijke vergelijkingen voor de uitleg. Meer zelfstandig geslaagde taken en lagere ervaringsscores wegen zwaarder dan tijdwinst. Bij tegenstrijdige uitkomsten benoemen we het voordeel én het nadeel. Met deze kleine gemakssteekproef kiezen we voor beschrijvende analyse en doen we geen uitspraken over statistisch bewezen effecten bij alle ouderen.</w:t>
+        <w:t>We beantwoorden de hoofdvraag met de volledige ontwerpvergelijking en gebruiken de vijf afzonderlijke vergelijkingen binnen het aangepaste ontwerp voor de uitleg. Meer zelfstandig geslaagde taken en lagere ervaringsscores wegen zwaarder dan tijdwinst. Bij tegenstrijdige uitkomsten benoemen we het voordeel én het nadeel. Met deze kleine gemakssteekproef kiezen we voor beschrijvende analyse en doen we geen uitspraken over statistisch bewezen effecten bij alle ouderen.</w:t>
       </w:r>
     </w:p>
     <w:p>

</xml_diff>